<commit_message>
fix(report): remove empty rows around repeated table groups
Move loop tags [#UNC]/[/UNC] and [#HD]/[/HD] from standalone rows
into the data row's first/last cells. This eliminates the extra
empty rows that docxtemplater's paragraphLoop creates.
</commit_message>
<xml_diff>
--- a/report_assets/Disbursement templates/2268.09.PN BCDX giai ngan HMTD.docx
+++ b/report_assets/Disbursement templates/2268.09.PN BCDX giai ngan HMTD.docx
@@ -1990,13 +1990,28 @@
       </w:tr>
       <w:tr>
         <w:tc>
+          <w:p>
+            <w:r>
+              <w:t xml:space="preserve">[#UNC]</w:t>
+            </w:r>
+          </w:p>
           <w:tcPr>
             <w:tcW w:w="0" w:type="auto"/>
             <w:vAlign w:val="center"/>
           </w:tcPr>
           <w:p>
+            <w:pPr>
+              <w:rPr>
+                <w:sz w:val="26"/>
+                <w:szCs w:val="26"/>
+              </w:rPr>
+            </w:pPr>
             <w:r>
-              <w:t xml:space="preserve">[#UNC]</w:t>
+              <w:rPr>
+                <w:sz w:val="26"/>
+                <w:szCs w:val="26"/>
+              </w:rPr>
+              <w:t>[STT]</w:t>
             </w:r>
           </w:p>
         </w:tc>
@@ -2006,8 +2021,18 @@
             <w:vAlign w:val="center"/>
           </w:tcPr>
           <w:p>
+            <w:pPr>
+              <w:rPr>
+                <w:sz w:val="26"/>
+                <w:szCs w:val="26"/>
+              </w:rPr>
+            </w:pPr>
             <w:r>
-              <w:t xml:space="preserve"/>
+              <w:rPr>
+                <w:sz w:val="26"/>
+                <w:szCs w:val="26"/>
+              </w:rPr>
+              <w:t>[Khách hàng thụ hưởng]</w:t>
             </w:r>
           </w:p>
         </w:tc>
@@ -2017,8 +2042,19 @@
             <w:vAlign w:val="center"/>
           </w:tcPr>
           <w:p>
+            <w:pPr>
+              <w:jc w:val="center"/>
+              <w:rPr>
+                <w:sz w:val="26"/>
+                <w:szCs w:val="26"/>
+              </w:rPr>
+            </w:pPr>
             <w:r>
-              <w:t xml:space="preserve"/>
+              <w:rPr>
+                <w:sz w:val="26"/>
+                <w:szCs w:val="26"/>
+              </w:rPr>
+              <w:t>[Số tài khoản]</w:t>
             </w:r>
           </w:p>
         </w:tc>
@@ -2028,8 +2064,19 @@
             <w:vAlign w:val="center"/>
           </w:tcPr>
           <w:p>
+            <w:pPr>
+              <w:jc w:val="center"/>
+              <w:rPr>
+                <w:sz w:val="26"/>
+                <w:szCs w:val="26"/>
+              </w:rPr>
+            </w:pPr>
             <w:r>
-              <w:t xml:space="preserve"/>
+              <w:rPr>
+                <w:sz w:val="26"/>
+                <w:szCs w:val="26"/>
+              </w:rPr>
+              <w:t>[Nơi mở tài khoản]</w:t>
             </w:r>
           </w:p>
         </w:tc>
@@ -2039,105 +2086,6 @@
             <w:vAlign w:val="center"/>
           </w:tcPr>
           <w:p>
-            <w:r>
-              <w:t xml:space="preserve"/>
-            </w:r>
-          </w:p>
-        </w:tc>
-      </w:tr>
-      <w:tr>
-        <w:tc>
-          <w:tcPr>
-            <w:tcW w:w="0" w:type="auto"/>
-            <w:vAlign w:val="center"/>
-          </w:tcPr>
-          <w:p>
-            <w:pPr>
-              <w:rPr>
-                <w:sz w:val="26"/>
-                <w:szCs w:val="26"/>
-              </w:rPr>
-            </w:pPr>
-            <w:r>
-              <w:rPr>
-                <w:sz w:val="26"/>
-                <w:szCs w:val="26"/>
-              </w:rPr>
-              <w:t>[STT]</w:t>
-            </w:r>
-          </w:p>
-        </w:tc>
-        <w:tc>
-          <w:tcPr>
-            <w:tcW w:w="0" w:type="auto"/>
-            <w:vAlign w:val="center"/>
-          </w:tcPr>
-          <w:p>
-            <w:pPr>
-              <w:rPr>
-                <w:sz w:val="26"/>
-                <w:szCs w:val="26"/>
-              </w:rPr>
-            </w:pPr>
-            <w:r>
-              <w:rPr>
-                <w:sz w:val="26"/>
-                <w:szCs w:val="26"/>
-              </w:rPr>
-              <w:t>[Khách hàng thụ hưởng]</w:t>
-            </w:r>
-          </w:p>
-        </w:tc>
-        <w:tc>
-          <w:tcPr>
-            <w:tcW w:w="0" w:type="auto"/>
-            <w:vAlign w:val="center"/>
-          </w:tcPr>
-          <w:p>
-            <w:pPr>
-              <w:jc w:val="center"/>
-              <w:rPr>
-                <w:sz w:val="26"/>
-                <w:szCs w:val="26"/>
-              </w:rPr>
-            </w:pPr>
-            <w:r>
-              <w:rPr>
-                <w:sz w:val="26"/>
-                <w:szCs w:val="26"/>
-              </w:rPr>
-              <w:t>[Số tài khoản]</w:t>
-            </w:r>
-          </w:p>
-        </w:tc>
-        <w:tc>
-          <w:tcPr>
-            <w:tcW w:w="0" w:type="auto"/>
-            <w:vAlign w:val="center"/>
-          </w:tcPr>
-          <w:p>
-            <w:pPr>
-              <w:jc w:val="center"/>
-              <w:rPr>
-                <w:sz w:val="26"/>
-                <w:szCs w:val="26"/>
-              </w:rPr>
-            </w:pPr>
-            <w:r>
-              <w:rPr>
-                <w:sz w:val="26"/>
-                <w:szCs w:val="26"/>
-              </w:rPr>
-              <w:t>[Nơi mở tài khoản]</w:t>
-            </w:r>
-          </w:p>
-        </w:tc>
-        <w:tc>
-          <w:tcPr>
-            <w:tcW w:w="0" w:type="auto"/>
-            <w:vAlign w:val="center"/>
-          </w:tcPr>
-          <w:p>
             <w:pPr>
               <w:jc w:val="right"/>
               <w:rPr>
@@ -2153,61 +2101,9 @@
               <w:t>[Số tiền]</w:t>
             </w:r>
           </w:p>
-        </w:tc>
-      </w:tr>
-      <w:tr>
-        <w:tc>
-          <w:tcPr>
-            <w:tcW w:w="0" w:type="auto"/>
-            <w:vAlign w:val="center"/>
-          </w:tcPr>
           <w:p>
             <w:r>
               <w:t xml:space="preserve">[/UNC]</w:t>
-            </w:r>
-          </w:p>
-        </w:tc>
-        <w:tc>
-          <w:tcPr>
-            <w:tcW w:w="0" w:type="auto"/>
-            <w:vAlign w:val="center"/>
-          </w:tcPr>
-          <w:p>
-            <w:r>
-              <w:t xml:space="preserve"/>
-            </w:r>
-          </w:p>
-        </w:tc>
-        <w:tc>
-          <w:tcPr>
-            <w:tcW w:w="0" w:type="auto"/>
-            <w:vAlign w:val="center"/>
-          </w:tcPr>
-          <w:p>
-            <w:r>
-              <w:t xml:space="preserve"/>
-            </w:r>
-          </w:p>
-        </w:tc>
-        <w:tc>
-          <w:tcPr>
-            <w:tcW w:w="0" w:type="auto"/>
-            <w:vAlign w:val="center"/>
-          </w:tcPr>
-          <w:p>
-            <w:r>
-              <w:t xml:space="preserve"/>
-            </w:r>
-          </w:p>
-        </w:tc>
-        <w:tc>
-          <w:tcPr>
-            <w:tcW w:w="0" w:type="auto"/>
-            <w:vAlign w:val="center"/>
-          </w:tcPr>
-          <w:p>
-            <w:r>
-              <w:t xml:space="preserve"/>
             </w:r>
           </w:p>
         </w:tc>
@@ -2551,13 +2447,32 @@
           <w:jc w:val="center"/>
         </w:trPr>
         <w:tc>
+          <w:p>
+            <w:r>
+              <w:t xml:space="preserve">[#HD]</w:t>
+            </w:r>
+          </w:p>
           <w:tcPr>
             <w:tcW w:w="0" w:type="auto"/>
             <w:vAlign w:val="center"/>
           </w:tcPr>
           <w:p>
+            <w:pPr>
+              <w:spacing w:line="276" w:lineRule="auto"/>
+              <w:jc w:val="center"/>
+              <w:rPr>
+                <w:sz w:val="26"/>
+                <w:szCs w:val="26"/>
+                <w:lang w:val="pt-BR"/>
+              </w:rPr>
+            </w:pPr>
             <w:r>
-              <w:t xml:space="preserve">[#HD]</w:t>
+              <w:rPr>
+                <w:sz w:val="26"/>
+                <w:szCs w:val="26"/>
+                <w:lang w:val="pt-BR"/>
+              </w:rPr>
+              <w:t>[STT]</w:t>
             </w:r>
           </w:p>
         </w:tc>
@@ -2567,8 +2482,22 @@
             <w:vAlign w:val="center"/>
           </w:tcPr>
           <w:p>
+            <w:pPr>
+              <w:spacing w:line="276" w:lineRule="auto"/>
+              <w:jc w:val="both"/>
+              <w:rPr>
+                <w:sz w:val="26"/>
+                <w:szCs w:val="26"/>
+                <w:lang w:val="pt-BR"/>
+              </w:rPr>
+            </w:pPr>
             <w:r>
-              <w:t xml:space="preserve"/>
+              <w:rPr>
+                <w:sz w:val="26"/>
+                <w:szCs w:val="26"/>
+                <w:lang w:val="pt-BR"/>
+              </w:rPr>
+              <w:t>[Tổ chức phát hành]</w:t>
             </w:r>
           </w:p>
         </w:tc>
@@ -2578,8 +2507,22 @@
             <w:vAlign w:val="center"/>
           </w:tcPr>
           <w:p>
+            <w:pPr>
+              <w:spacing w:line="276" w:lineRule="auto"/>
+              <w:jc w:val="center"/>
+              <w:rPr>
+                <w:sz w:val="26"/>
+                <w:szCs w:val="26"/>
+                <w:lang w:val="pt-BR"/>
+              </w:rPr>
+            </w:pPr>
             <w:r>
-              <w:t xml:space="preserve"/>
+              <w:rPr>
+                <w:sz w:val="26"/>
+                <w:szCs w:val="26"/>
+                <w:lang w:val="pt-BR"/>
+              </w:rPr>
+              <w:t>[Số hóa đơn]</w:t>
             </w:r>
           </w:p>
         </w:tc>
@@ -2589,8 +2532,22 @@
             <w:vAlign w:val="center"/>
           </w:tcPr>
           <w:p>
+            <w:pPr>
+              <w:spacing w:line="276" w:lineRule="auto"/>
+              <w:jc w:val="center"/>
+              <w:rPr>
+                <w:sz w:val="26"/>
+                <w:szCs w:val="26"/>
+                <w:lang w:val="pt-BR"/>
+              </w:rPr>
+            </w:pPr>
             <w:r>
-              <w:t xml:space="preserve"/>
+              <w:rPr>
+                <w:sz w:val="26"/>
+                <w:szCs w:val="26"/>
+                <w:lang w:val="pt-BR"/>
+              </w:rPr>
+              <w:t>[Ngày hóa đơn]</w:t>
             </w:r>
           </w:p>
         </w:tc>
@@ -2600,122 +2557,6 @@
             <w:vAlign w:val="center"/>
           </w:tcPr>
           <w:p>
-            <w:r>
-              <w:t xml:space="preserve"/>
-            </w:r>
-          </w:p>
-        </w:tc>
-      </w:tr>
-      <w:tr>
-        <w:trPr>
-          <w:jc w:val="center"/>
-        </w:trPr>
-        <w:tc>
-          <w:tcPr>
-            <w:tcW w:w="0" w:type="auto"/>
-            <w:vAlign w:val="center"/>
-          </w:tcPr>
-          <w:p>
-            <w:pPr>
-              <w:spacing w:line="276" w:lineRule="auto"/>
-              <w:jc w:val="center"/>
-              <w:rPr>
-                <w:sz w:val="26"/>
-                <w:szCs w:val="26"/>
-                <w:lang w:val="pt-BR"/>
-              </w:rPr>
-            </w:pPr>
-            <w:r>
-              <w:rPr>
-                <w:sz w:val="26"/>
-                <w:szCs w:val="26"/>
-                <w:lang w:val="pt-BR"/>
-              </w:rPr>
-              <w:t>[STT]</w:t>
-            </w:r>
-          </w:p>
-        </w:tc>
-        <w:tc>
-          <w:tcPr>
-            <w:tcW w:w="0" w:type="auto"/>
-            <w:vAlign w:val="center"/>
-          </w:tcPr>
-          <w:p>
-            <w:pPr>
-              <w:spacing w:line="276" w:lineRule="auto"/>
-              <w:jc w:val="both"/>
-              <w:rPr>
-                <w:sz w:val="26"/>
-                <w:szCs w:val="26"/>
-                <w:lang w:val="pt-BR"/>
-              </w:rPr>
-            </w:pPr>
-            <w:r>
-              <w:rPr>
-                <w:sz w:val="26"/>
-                <w:szCs w:val="26"/>
-                <w:lang w:val="pt-BR"/>
-              </w:rPr>
-              <w:t>[Tổ chức phát hành]</w:t>
-            </w:r>
-          </w:p>
-        </w:tc>
-        <w:tc>
-          <w:tcPr>
-            <w:tcW w:w="0" w:type="auto"/>
-            <w:vAlign w:val="center"/>
-          </w:tcPr>
-          <w:p>
-            <w:pPr>
-              <w:spacing w:line="276" w:lineRule="auto"/>
-              <w:jc w:val="center"/>
-              <w:rPr>
-                <w:sz w:val="26"/>
-                <w:szCs w:val="26"/>
-                <w:lang w:val="pt-BR"/>
-              </w:rPr>
-            </w:pPr>
-            <w:r>
-              <w:rPr>
-                <w:sz w:val="26"/>
-                <w:szCs w:val="26"/>
-                <w:lang w:val="pt-BR"/>
-              </w:rPr>
-              <w:t>[Số hóa đơn]</w:t>
-            </w:r>
-          </w:p>
-        </w:tc>
-        <w:tc>
-          <w:tcPr>
-            <w:tcW w:w="0" w:type="auto"/>
-            <w:vAlign w:val="center"/>
-          </w:tcPr>
-          <w:p>
-            <w:pPr>
-              <w:spacing w:line="276" w:lineRule="auto"/>
-              <w:jc w:val="center"/>
-              <w:rPr>
-                <w:sz w:val="26"/>
-                <w:szCs w:val="26"/>
-                <w:lang w:val="pt-BR"/>
-              </w:rPr>
-            </w:pPr>
-            <w:r>
-              <w:rPr>
-                <w:sz w:val="26"/>
-                <w:szCs w:val="26"/>
-                <w:lang w:val="pt-BR"/>
-              </w:rPr>
-              <w:t>[Ngày hóa đơn]</w:t>
-            </w:r>
-          </w:p>
-        </w:tc>
-        <w:tc>
-          <w:tcPr>
-            <w:tcW w:w="0" w:type="auto"/>
-            <w:vAlign w:val="center"/>
-          </w:tcPr>
-          <w:p>
             <w:pPr>
               <w:spacing w:line="276" w:lineRule="auto"/>
               <w:jc w:val="right"/>
@@ -2734,64 +2575,9 @@
               <w:t>[Số tiền hóa đơn]</w:t>
             </w:r>
           </w:p>
-        </w:tc>
-      </w:tr>
-      <w:tr>
-        <w:trPr>
-          <w:jc w:val="center"/>
-        </w:trPr>
-        <w:tc>
-          <w:tcPr>
-            <w:tcW w:w="0" w:type="auto"/>
-            <w:vAlign w:val="center"/>
-          </w:tcPr>
           <w:p>
             <w:r>
               <w:t xml:space="preserve">[/HD]</w:t>
-            </w:r>
-          </w:p>
-        </w:tc>
-        <w:tc>
-          <w:tcPr>
-            <w:tcW w:w="0" w:type="auto"/>
-            <w:vAlign w:val="center"/>
-          </w:tcPr>
-          <w:p>
-            <w:r>
-              <w:t xml:space="preserve"/>
-            </w:r>
-          </w:p>
-        </w:tc>
-        <w:tc>
-          <w:tcPr>
-            <w:tcW w:w="0" w:type="auto"/>
-            <w:vAlign w:val="center"/>
-          </w:tcPr>
-          <w:p>
-            <w:r>
-              <w:t xml:space="preserve"/>
-            </w:r>
-          </w:p>
-        </w:tc>
-        <w:tc>
-          <w:tcPr>
-            <w:tcW w:w="0" w:type="auto"/>
-            <w:vAlign w:val="center"/>
-          </w:tcPr>
-          <w:p>
-            <w:r>
-              <w:t xml:space="preserve"/>
-            </w:r>
-          </w:p>
-        </w:tc>
-        <w:tc>
-          <w:tcPr>
-            <w:tcW w:w="0" w:type="auto"/>
-            <w:vAlign w:val="center"/>
-          </w:tcPr>
-          <w:p>
-            <w:r>
-              <w:t xml:space="preserve"/>
             </w:r>
           </w:p>
         </w:tc>
@@ -3453,13 +3239,28 @@
       </w:tr>
       <w:tr>
         <w:tc>
+          <w:p>
+            <w:r>
+              <w:t xml:space="preserve">[#UNC]</w:t>
+            </w:r>
+          </w:p>
           <w:tcPr>
             <w:tcW w:w="0" w:type="auto"/>
             <w:vAlign w:val="center"/>
           </w:tcPr>
           <w:p>
+            <w:pPr>
+              <w:rPr>
+                <w:sz w:val="26"/>
+                <w:szCs w:val="26"/>
+              </w:rPr>
+            </w:pPr>
             <w:r>
-              <w:t xml:space="preserve">[#UNC]</w:t>
+              <w:rPr>
+                <w:sz w:val="26"/>
+                <w:szCs w:val="26"/>
+              </w:rPr>
+              <w:t>[STT]</w:t>
             </w:r>
           </w:p>
         </w:tc>
@@ -3469,8 +3270,18 @@
             <w:vAlign w:val="center"/>
           </w:tcPr>
           <w:p>
+            <w:pPr>
+              <w:rPr>
+                <w:sz w:val="26"/>
+                <w:szCs w:val="26"/>
+              </w:rPr>
+            </w:pPr>
             <w:r>
-              <w:t xml:space="preserve"/>
+              <w:rPr>
+                <w:sz w:val="26"/>
+                <w:szCs w:val="26"/>
+              </w:rPr>
+              <w:t>[Khách hàng thụ hưởng]</w:t>
             </w:r>
           </w:p>
         </w:tc>
@@ -3480,8 +3291,19 @@
             <w:vAlign w:val="center"/>
           </w:tcPr>
           <w:p>
+            <w:pPr>
+              <w:jc w:val="center"/>
+              <w:rPr>
+                <w:sz w:val="26"/>
+                <w:szCs w:val="26"/>
+              </w:rPr>
+            </w:pPr>
             <w:r>
-              <w:t xml:space="preserve"/>
+              <w:rPr>
+                <w:sz w:val="26"/>
+                <w:szCs w:val="26"/>
+              </w:rPr>
+              <w:t>[Số tài khoản]</w:t>
             </w:r>
           </w:p>
         </w:tc>
@@ -3491,8 +3313,19 @@
             <w:vAlign w:val="center"/>
           </w:tcPr>
           <w:p>
+            <w:pPr>
+              <w:jc w:val="center"/>
+              <w:rPr>
+                <w:sz w:val="26"/>
+                <w:szCs w:val="26"/>
+              </w:rPr>
+            </w:pPr>
             <w:r>
-              <w:t xml:space="preserve"/>
+              <w:rPr>
+                <w:sz w:val="26"/>
+                <w:szCs w:val="26"/>
+              </w:rPr>
+              <w:t>[Nơi mở tài khoản]</w:t>
             </w:r>
           </w:p>
         </w:tc>
@@ -3502,105 +3335,6 @@
             <w:vAlign w:val="center"/>
           </w:tcPr>
           <w:p>
-            <w:r>
-              <w:t xml:space="preserve"/>
-            </w:r>
-          </w:p>
-        </w:tc>
-      </w:tr>
-      <w:tr>
-        <w:tc>
-          <w:tcPr>
-            <w:tcW w:w="0" w:type="auto"/>
-            <w:vAlign w:val="center"/>
-          </w:tcPr>
-          <w:p>
-            <w:pPr>
-              <w:rPr>
-                <w:sz w:val="26"/>
-                <w:szCs w:val="26"/>
-              </w:rPr>
-            </w:pPr>
-            <w:r>
-              <w:rPr>
-                <w:sz w:val="26"/>
-                <w:szCs w:val="26"/>
-              </w:rPr>
-              <w:t>[STT]</w:t>
-            </w:r>
-          </w:p>
-        </w:tc>
-        <w:tc>
-          <w:tcPr>
-            <w:tcW w:w="0" w:type="auto"/>
-            <w:vAlign w:val="center"/>
-          </w:tcPr>
-          <w:p>
-            <w:pPr>
-              <w:rPr>
-                <w:sz w:val="26"/>
-                <w:szCs w:val="26"/>
-              </w:rPr>
-            </w:pPr>
-            <w:r>
-              <w:rPr>
-                <w:sz w:val="26"/>
-                <w:szCs w:val="26"/>
-              </w:rPr>
-              <w:t>[Khách hàng thụ hưởng]</w:t>
-            </w:r>
-          </w:p>
-        </w:tc>
-        <w:tc>
-          <w:tcPr>
-            <w:tcW w:w="0" w:type="auto"/>
-            <w:vAlign w:val="center"/>
-          </w:tcPr>
-          <w:p>
-            <w:pPr>
-              <w:jc w:val="center"/>
-              <w:rPr>
-                <w:sz w:val="26"/>
-                <w:szCs w:val="26"/>
-              </w:rPr>
-            </w:pPr>
-            <w:r>
-              <w:rPr>
-                <w:sz w:val="26"/>
-                <w:szCs w:val="26"/>
-              </w:rPr>
-              <w:t>[Số tài khoản]</w:t>
-            </w:r>
-          </w:p>
-        </w:tc>
-        <w:tc>
-          <w:tcPr>
-            <w:tcW w:w="0" w:type="auto"/>
-            <w:vAlign w:val="center"/>
-          </w:tcPr>
-          <w:p>
-            <w:pPr>
-              <w:jc w:val="center"/>
-              <w:rPr>
-                <w:sz w:val="26"/>
-                <w:szCs w:val="26"/>
-              </w:rPr>
-            </w:pPr>
-            <w:r>
-              <w:rPr>
-                <w:sz w:val="26"/>
-                <w:szCs w:val="26"/>
-              </w:rPr>
-              <w:t>[Nơi mở tài khoản]</w:t>
-            </w:r>
-          </w:p>
-        </w:tc>
-        <w:tc>
-          <w:tcPr>
-            <w:tcW w:w="0" w:type="auto"/>
-            <w:vAlign w:val="center"/>
-          </w:tcPr>
-          <w:p>
             <w:pPr>
               <w:jc w:val="right"/>
               <w:rPr>
@@ -3618,61 +3352,9 @@
               <w:t>[Số tiền]</w:t>
             </w:r>
           </w:p>
-        </w:tc>
-      </w:tr>
-      <w:tr>
-        <w:tc>
-          <w:tcPr>
-            <w:tcW w:w="0" w:type="auto"/>
-            <w:vAlign w:val="center"/>
-          </w:tcPr>
           <w:p>
             <w:r>
               <w:t xml:space="preserve">[/UNC]</w:t>
-            </w:r>
-          </w:p>
-        </w:tc>
-        <w:tc>
-          <w:tcPr>
-            <w:tcW w:w="0" w:type="auto"/>
-            <w:vAlign w:val="center"/>
-          </w:tcPr>
-          <w:p>
-            <w:r>
-              <w:t xml:space="preserve"/>
-            </w:r>
-          </w:p>
-        </w:tc>
-        <w:tc>
-          <w:tcPr>
-            <w:tcW w:w="0" w:type="auto"/>
-            <w:vAlign w:val="center"/>
-          </w:tcPr>
-          <w:p>
-            <w:r>
-              <w:t xml:space="preserve"/>
-            </w:r>
-          </w:p>
-        </w:tc>
-        <w:tc>
-          <w:tcPr>
-            <w:tcW w:w="0" w:type="auto"/>
-            <w:vAlign w:val="center"/>
-          </w:tcPr>
-          <w:p>
-            <w:r>
-              <w:t xml:space="preserve"/>
-            </w:r>
-          </w:p>
-        </w:tc>
-        <w:tc>
-          <w:tcPr>
-            <w:tcW w:w="0" w:type="auto"/>
-            <w:vAlign w:val="center"/>
-          </w:tcPr>
-          <w:p>
-            <w:r>
-              <w:t xml:space="preserve"/>
             </w:r>
           </w:p>
         </w:tc>

</xml_diff>

<commit_message>
fix(docx): restore original templates and strip empty rows post-render
Revert corrupted templates back to git originals. Instead of modifying
template XML, strip empty table rows (left by loop tag removal) in
docx-engine after rendering. Also removes invalid self-closing <w:p/>.
</commit_message>
<xml_diff>
--- a/report_assets/Disbursement templates/2268.09.PN BCDX giai ngan HMTD.docx
+++ b/report_assets/Disbursement templates/2268.09.PN BCDX giai ngan HMTD.docx
@@ -1990,11 +1990,63 @@
       </w:tr>
       <w:tr>
         <w:tc>
+          <w:tcPr>
+            <w:tcW w:w="0" w:type="auto"/>
+            <w:vAlign w:val="center"/>
+          </w:tcPr>
           <w:p>
             <w:r>
               <w:t xml:space="preserve">[#UNC]</w:t>
             </w:r>
           </w:p>
+        </w:tc>
+        <w:tc>
+          <w:tcPr>
+            <w:tcW w:w="0" w:type="auto"/>
+            <w:vAlign w:val="center"/>
+          </w:tcPr>
+          <w:p>
+            <w:r>
+              <w:t xml:space="preserve"/>
+            </w:r>
+          </w:p>
+        </w:tc>
+        <w:tc>
+          <w:tcPr>
+            <w:tcW w:w="0" w:type="auto"/>
+            <w:vAlign w:val="center"/>
+          </w:tcPr>
+          <w:p>
+            <w:r>
+              <w:t xml:space="preserve"/>
+            </w:r>
+          </w:p>
+        </w:tc>
+        <w:tc>
+          <w:tcPr>
+            <w:tcW w:w="0" w:type="auto"/>
+            <w:vAlign w:val="center"/>
+          </w:tcPr>
+          <w:p>
+            <w:r>
+              <w:t xml:space="preserve"/>
+            </w:r>
+          </w:p>
+        </w:tc>
+        <w:tc>
+          <w:tcPr>
+            <w:tcW w:w="0" w:type="auto"/>
+            <w:vAlign w:val="center"/>
+          </w:tcPr>
+          <w:p>
+            <w:r>
+              <w:t xml:space="preserve"/>
+            </w:r>
+          </w:p>
+        </w:tc>
+      </w:tr>
+      <w:tr>
+        <w:tc>
           <w:tcPr>
             <w:tcW w:w="0" w:type="auto"/>
             <w:vAlign w:val="center"/>
@@ -2101,9 +2153,61 @@
               <w:t>[Số tiền]</w:t>
             </w:r>
           </w:p>
+        </w:tc>
+      </w:tr>
+      <w:tr>
+        <w:tc>
+          <w:tcPr>
+            <w:tcW w:w="0" w:type="auto"/>
+            <w:vAlign w:val="center"/>
+          </w:tcPr>
           <w:p>
             <w:r>
               <w:t xml:space="preserve">[/UNC]</w:t>
+            </w:r>
+          </w:p>
+        </w:tc>
+        <w:tc>
+          <w:tcPr>
+            <w:tcW w:w="0" w:type="auto"/>
+            <w:vAlign w:val="center"/>
+          </w:tcPr>
+          <w:p>
+            <w:r>
+              <w:t xml:space="preserve"/>
+            </w:r>
+          </w:p>
+        </w:tc>
+        <w:tc>
+          <w:tcPr>
+            <w:tcW w:w="0" w:type="auto"/>
+            <w:vAlign w:val="center"/>
+          </w:tcPr>
+          <w:p>
+            <w:r>
+              <w:t xml:space="preserve"/>
+            </w:r>
+          </w:p>
+        </w:tc>
+        <w:tc>
+          <w:tcPr>
+            <w:tcW w:w="0" w:type="auto"/>
+            <w:vAlign w:val="center"/>
+          </w:tcPr>
+          <w:p>
+            <w:r>
+              <w:t xml:space="preserve"/>
+            </w:r>
+          </w:p>
+        </w:tc>
+        <w:tc>
+          <w:tcPr>
+            <w:tcW w:w="0" w:type="auto"/>
+            <w:vAlign w:val="center"/>
+          </w:tcPr>
+          <w:p>
+            <w:r>
+              <w:t xml:space="preserve"/>
             </w:r>
           </w:p>
         </w:tc>
@@ -2447,11 +2551,66 @@
           <w:jc w:val="center"/>
         </w:trPr>
         <w:tc>
+          <w:tcPr>
+            <w:tcW w:w="0" w:type="auto"/>
+            <w:vAlign w:val="center"/>
+          </w:tcPr>
           <w:p>
             <w:r>
               <w:t xml:space="preserve">[#HD]</w:t>
             </w:r>
           </w:p>
+        </w:tc>
+        <w:tc>
+          <w:tcPr>
+            <w:tcW w:w="0" w:type="auto"/>
+            <w:vAlign w:val="center"/>
+          </w:tcPr>
+          <w:p>
+            <w:r>
+              <w:t xml:space="preserve"/>
+            </w:r>
+          </w:p>
+        </w:tc>
+        <w:tc>
+          <w:tcPr>
+            <w:tcW w:w="0" w:type="auto"/>
+            <w:vAlign w:val="center"/>
+          </w:tcPr>
+          <w:p>
+            <w:r>
+              <w:t xml:space="preserve"/>
+            </w:r>
+          </w:p>
+        </w:tc>
+        <w:tc>
+          <w:tcPr>
+            <w:tcW w:w="0" w:type="auto"/>
+            <w:vAlign w:val="center"/>
+          </w:tcPr>
+          <w:p>
+            <w:r>
+              <w:t xml:space="preserve"/>
+            </w:r>
+          </w:p>
+        </w:tc>
+        <w:tc>
+          <w:tcPr>
+            <w:tcW w:w="0" w:type="auto"/>
+            <w:vAlign w:val="center"/>
+          </w:tcPr>
+          <w:p>
+            <w:r>
+              <w:t xml:space="preserve"/>
+            </w:r>
+          </w:p>
+        </w:tc>
+      </w:tr>
+      <w:tr>
+        <w:trPr>
+          <w:jc w:val="center"/>
+        </w:trPr>
+        <w:tc>
           <w:tcPr>
             <w:tcW w:w="0" w:type="auto"/>
             <w:vAlign w:val="center"/>
@@ -2575,9 +2734,64 @@
               <w:t>[Số tiền hóa đơn]</w:t>
             </w:r>
           </w:p>
+        </w:tc>
+      </w:tr>
+      <w:tr>
+        <w:trPr>
+          <w:jc w:val="center"/>
+        </w:trPr>
+        <w:tc>
+          <w:tcPr>
+            <w:tcW w:w="0" w:type="auto"/>
+            <w:vAlign w:val="center"/>
+          </w:tcPr>
           <w:p>
             <w:r>
               <w:t xml:space="preserve">[/HD]</w:t>
+            </w:r>
+          </w:p>
+        </w:tc>
+        <w:tc>
+          <w:tcPr>
+            <w:tcW w:w="0" w:type="auto"/>
+            <w:vAlign w:val="center"/>
+          </w:tcPr>
+          <w:p>
+            <w:r>
+              <w:t xml:space="preserve"/>
+            </w:r>
+          </w:p>
+        </w:tc>
+        <w:tc>
+          <w:tcPr>
+            <w:tcW w:w="0" w:type="auto"/>
+            <w:vAlign w:val="center"/>
+          </w:tcPr>
+          <w:p>
+            <w:r>
+              <w:t xml:space="preserve"/>
+            </w:r>
+          </w:p>
+        </w:tc>
+        <w:tc>
+          <w:tcPr>
+            <w:tcW w:w="0" w:type="auto"/>
+            <w:vAlign w:val="center"/>
+          </w:tcPr>
+          <w:p>
+            <w:r>
+              <w:t xml:space="preserve"/>
+            </w:r>
+          </w:p>
+        </w:tc>
+        <w:tc>
+          <w:tcPr>
+            <w:tcW w:w="0" w:type="auto"/>
+            <w:vAlign w:val="center"/>
+          </w:tcPr>
+          <w:p>
+            <w:r>
+              <w:t xml:space="preserve"/>
             </w:r>
           </w:p>
         </w:tc>
@@ -3239,11 +3453,63 @@
       </w:tr>
       <w:tr>
         <w:tc>
+          <w:tcPr>
+            <w:tcW w:w="0" w:type="auto"/>
+            <w:vAlign w:val="center"/>
+          </w:tcPr>
           <w:p>
             <w:r>
               <w:t xml:space="preserve">[#UNC]</w:t>
             </w:r>
           </w:p>
+        </w:tc>
+        <w:tc>
+          <w:tcPr>
+            <w:tcW w:w="0" w:type="auto"/>
+            <w:vAlign w:val="center"/>
+          </w:tcPr>
+          <w:p>
+            <w:r>
+              <w:t xml:space="preserve"/>
+            </w:r>
+          </w:p>
+        </w:tc>
+        <w:tc>
+          <w:tcPr>
+            <w:tcW w:w="0" w:type="auto"/>
+            <w:vAlign w:val="center"/>
+          </w:tcPr>
+          <w:p>
+            <w:r>
+              <w:t xml:space="preserve"/>
+            </w:r>
+          </w:p>
+        </w:tc>
+        <w:tc>
+          <w:tcPr>
+            <w:tcW w:w="0" w:type="auto"/>
+            <w:vAlign w:val="center"/>
+          </w:tcPr>
+          <w:p>
+            <w:r>
+              <w:t xml:space="preserve"/>
+            </w:r>
+          </w:p>
+        </w:tc>
+        <w:tc>
+          <w:tcPr>
+            <w:tcW w:w="0" w:type="auto"/>
+            <w:vAlign w:val="center"/>
+          </w:tcPr>
+          <w:p>
+            <w:r>
+              <w:t xml:space="preserve"/>
+            </w:r>
+          </w:p>
+        </w:tc>
+      </w:tr>
+      <w:tr>
+        <w:tc>
           <w:tcPr>
             <w:tcW w:w="0" w:type="auto"/>
             <w:vAlign w:val="center"/>
@@ -3352,9 +3618,61 @@
               <w:t>[Số tiền]</w:t>
             </w:r>
           </w:p>
+        </w:tc>
+      </w:tr>
+      <w:tr>
+        <w:tc>
+          <w:tcPr>
+            <w:tcW w:w="0" w:type="auto"/>
+            <w:vAlign w:val="center"/>
+          </w:tcPr>
           <w:p>
             <w:r>
               <w:t xml:space="preserve">[/UNC]</w:t>
+            </w:r>
+          </w:p>
+        </w:tc>
+        <w:tc>
+          <w:tcPr>
+            <w:tcW w:w="0" w:type="auto"/>
+            <w:vAlign w:val="center"/>
+          </w:tcPr>
+          <w:p>
+            <w:r>
+              <w:t xml:space="preserve"/>
+            </w:r>
+          </w:p>
+        </w:tc>
+        <w:tc>
+          <w:tcPr>
+            <w:tcW w:w="0" w:type="auto"/>
+            <w:vAlign w:val="center"/>
+          </w:tcPr>
+          <w:p>
+            <w:r>
+              <w:t xml:space="preserve"/>
+            </w:r>
+          </w:p>
+        </w:tc>
+        <w:tc>
+          <w:tcPr>
+            <w:tcW w:w="0" w:type="auto"/>
+            <w:vAlign w:val="center"/>
+          </w:tcPr>
+          <w:p>
+            <w:r>
+              <w:t xml:space="preserve"/>
+            </w:r>
+          </w:p>
+        </w:tc>
+        <w:tc>
+          <w:tcPr>
+            <w:tcW w:w="0" w:type="auto"/>
+            <w:vAlign w:val="center"/>
+          </w:tcPr>
+          <w:p>
+            <w:r>
+              <w:t xml:space="preserve"/>
             </w:r>
           </w:p>
         </w:tc>

</xml_diff>